<commit_message>
v1.0: hub cleanup, clear button, manual v1.2
</commit_message>
<xml_diff>
--- a/NCA_Assistant_User_Manual_v1.2.docx
+++ b/NCA_Assistant_User_Manual_v1.2.docx
@@ -156,12 +156,6 @@
         <w:gridCol w:w="3000"/>
       </w:tblGrid>
       <w:tr>
-        <w:tblPrEx>
-          <w:tblCellMar>
-            <w:top w:w="0" w:type="dxa"/>
-            <w:bottom w:w="0" w:type="dxa"/>
-          </w:tblCellMar>
-        </w:tblPrEx>
         <w:tc>
           <w:tcPr>
             <w:tcW w:w="1500" w:type="dxa"/>
@@ -284,12 +278,6 @@
         </w:tc>
       </w:tr>
       <w:tr>
-        <w:tblPrEx>
-          <w:tblCellMar>
-            <w:top w:w="0" w:type="dxa"/>
-            <w:bottom w:w="0" w:type="dxa"/>
-          </w:tblCellMar>
-        </w:tblPrEx>
         <w:tc>
           <w:tcPr>
             <w:tcW w:w="1500" w:type="dxa"/>
@@ -388,12 +376,6 @@
         </w:tc>
       </w:tr>
       <w:tr>
-        <w:tblPrEx>
-          <w:tblCellMar>
-            <w:top w:w="0" w:type="dxa"/>
-            <w:bottom w:w="0" w:type="dxa"/>
-          </w:tblCellMar>
-        </w:tblPrEx>
         <w:tc>
           <w:tcPr>
             <w:tcW w:w="1500" w:type="dxa"/>
@@ -492,12 +474,6 @@
         </w:tc>
       </w:tr>
       <w:tr>
-        <w:tblPrEx>
-          <w:tblCellMar>
-            <w:top w:w="0" w:type="dxa"/>
-            <w:bottom w:w="0" w:type="dxa"/>
-          </w:tblCellMar>
-        </w:tblPrEx>
         <w:tc>
           <w:tcPr>
             <w:tcW w:w="1500" w:type="dxa"/>
@@ -617,6 +593,7 @@
         <w:alias w:val="Table of Contents"/>
         <w:id w:val="-1533791606"/>
       </w:sdtPr>
+      <w:sdtEndPr/>
       <w:sdtContent>
         <w:p>
           <w:pPr>
@@ -4764,12 +4741,6 @@
         <w:gridCol w:w="5826"/>
       </w:tblGrid>
       <w:tr>
-        <w:tblPrEx>
-          <w:tblCellMar>
-            <w:top w:w="0" w:type="dxa"/>
-            <w:bottom w:w="0" w:type="dxa"/>
-          </w:tblCellMar>
-        </w:tblPrEx>
         <w:tc>
           <w:tcPr>
             <w:tcW w:w="1800" w:type="dxa"/>
@@ -4862,12 +4833,6 @@
         </w:tc>
       </w:tr>
       <w:tr>
-        <w:tblPrEx>
-          <w:tblCellMar>
-            <w:top w:w="0" w:type="dxa"/>
-            <w:bottom w:w="0" w:type="dxa"/>
-          </w:tblCellMar>
-        </w:tblPrEx>
         <w:tc>
           <w:tcPr>
             <w:tcW w:w="1800" w:type="dxa"/>
@@ -4948,12 +4913,6 @@
         </w:tc>
       </w:tr>
       <w:tr>
-        <w:tblPrEx>
-          <w:tblCellMar>
-            <w:top w:w="0" w:type="dxa"/>
-            <w:bottom w:w="0" w:type="dxa"/>
-          </w:tblCellMar>
-        </w:tblPrEx>
         <w:tc>
           <w:tcPr>
             <w:tcW w:w="1800" w:type="dxa"/>
@@ -5034,12 +4993,6 @@
         </w:tc>
       </w:tr>
       <w:tr>
-        <w:tblPrEx>
-          <w:tblCellMar>
-            <w:top w:w="0" w:type="dxa"/>
-            <w:bottom w:w="0" w:type="dxa"/>
-          </w:tblCellMar>
-        </w:tblPrEx>
         <w:tc>
           <w:tcPr>
             <w:tcW w:w="1800" w:type="dxa"/>
@@ -5120,12 +5073,6 @@
         </w:tc>
       </w:tr>
       <w:tr>
-        <w:tblPrEx>
-          <w:tblCellMar>
-            <w:top w:w="0" w:type="dxa"/>
-            <w:bottom w:w="0" w:type="dxa"/>
-          </w:tblCellMar>
-        </w:tblPrEx>
         <w:tc>
           <w:tcPr>
             <w:tcW w:w="1800" w:type="dxa"/>
@@ -5206,12 +5153,6 @@
         </w:tc>
       </w:tr>
       <w:tr>
-        <w:tblPrEx>
-          <w:tblCellMar>
-            <w:top w:w="0" w:type="dxa"/>
-            <w:bottom w:w="0" w:type="dxa"/>
-          </w:tblCellMar>
-        </w:tblPrEx>
         <w:tc>
           <w:tcPr>
             <w:tcW w:w="1800" w:type="dxa"/>
@@ -5292,12 +5233,6 @@
         </w:tc>
       </w:tr>
       <w:tr>
-        <w:tblPrEx>
-          <w:tblCellMar>
-            <w:top w:w="0" w:type="dxa"/>
-            <w:bottom w:w="0" w:type="dxa"/>
-          </w:tblCellMar>
-        </w:tblPrEx>
         <w:tc>
           <w:tcPr>
             <w:tcW w:w="1800" w:type="dxa"/>
@@ -5378,12 +5313,6 @@
         </w:tc>
       </w:tr>
       <w:tr>
-        <w:tblPrEx>
-          <w:tblCellMar>
-            <w:top w:w="0" w:type="dxa"/>
-            <w:bottom w:w="0" w:type="dxa"/>
-          </w:tblCellMar>
-        </w:tblPrEx>
         <w:tc>
           <w:tcPr>
             <w:tcW w:w="1800" w:type="dxa"/>
@@ -5630,12 +5559,6 @@
         <w:gridCol w:w="4513"/>
       </w:tblGrid>
       <w:tr>
-        <w:tblPrEx>
-          <w:tblCellMar>
-            <w:top w:w="0" w:type="dxa"/>
-            <w:bottom w:w="0" w:type="dxa"/>
-          </w:tblCellMar>
-        </w:tblPrEx>
         <w:tc>
           <w:tcPr>
             <w:tcW w:w="4513" w:type="dxa"/>
@@ -5698,12 +5621,6 @@
         </w:tc>
       </w:tr>
       <w:tr>
-        <w:tblPrEx>
-          <w:tblCellMar>
-            <w:top w:w="0" w:type="dxa"/>
-            <w:bottom w:w="0" w:type="dxa"/>
-          </w:tblCellMar>
-        </w:tblPrEx>
         <w:tc>
           <w:tcPr>
             <w:tcW w:w="4513" w:type="dxa"/>
@@ -5758,12 +5675,6 @@
         </w:tc>
       </w:tr>
       <w:tr>
-        <w:tblPrEx>
-          <w:tblCellMar>
-            <w:top w:w="0" w:type="dxa"/>
-            <w:bottom w:w="0" w:type="dxa"/>
-          </w:tblCellMar>
-        </w:tblPrEx>
         <w:tc>
           <w:tcPr>
             <w:tcW w:w="4513" w:type="dxa"/>
@@ -5818,12 +5729,6 @@
         </w:tc>
       </w:tr>
       <w:tr>
-        <w:tblPrEx>
-          <w:tblCellMar>
-            <w:top w:w="0" w:type="dxa"/>
-            <w:bottom w:w="0" w:type="dxa"/>
-          </w:tblCellMar>
-        </w:tblPrEx>
         <w:tc>
           <w:tcPr>
             <w:tcW w:w="4513" w:type="dxa"/>
@@ -5878,12 +5783,6 @@
         </w:tc>
       </w:tr>
       <w:tr>
-        <w:tblPrEx>
-          <w:tblCellMar>
-            <w:top w:w="0" w:type="dxa"/>
-            <w:bottom w:w="0" w:type="dxa"/>
-          </w:tblCellMar>
-        </w:tblPrEx>
         <w:tc>
           <w:tcPr>
             <w:tcW w:w="4513" w:type="dxa"/>
@@ -5938,12 +5837,6 @@
         </w:tc>
       </w:tr>
       <w:tr>
-        <w:tblPrEx>
-          <w:tblCellMar>
-            <w:top w:w="0" w:type="dxa"/>
-            <w:bottom w:w="0" w:type="dxa"/>
-          </w:tblCellMar>
-        </w:tblPrEx>
         <w:tc>
           <w:tcPr>
             <w:tcW w:w="4513" w:type="dxa"/>
@@ -5998,12 +5891,6 @@
         </w:tc>
       </w:tr>
       <w:tr>
-        <w:tblPrEx>
-          <w:tblCellMar>
-            <w:top w:w="0" w:type="dxa"/>
-            <w:bottom w:w="0" w:type="dxa"/>
-          </w:tblCellMar>
-        </w:tblPrEx>
         <w:tc>
           <w:tcPr>
             <w:tcW w:w="4513" w:type="dxa"/>
@@ -6058,12 +5945,6 @@
         </w:tc>
       </w:tr>
       <w:tr>
-        <w:tblPrEx>
-          <w:tblCellMar>
-            <w:top w:w="0" w:type="dxa"/>
-            <w:bottom w:w="0" w:type="dxa"/>
-          </w:tblCellMar>
-        </w:tblPrEx>
         <w:tc>
           <w:tcPr>
             <w:tcW w:w="4513" w:type="dxa"/>
@@ -6151,12 +6032,6 @@
         <w:gridCol w:w="3513"/>
       </w:tblGrid>
       <w:tr>
-        <w:tblPrEx>
-          <w:tblCellMar>
-            <w:top w:w="0" w:type="dxa"/>
-            <w:bottom w:w="0" w:type="dxa"/>
-          </w:tblCellMar>
-        </w:tblPrEx>
         <w:tc>
           <w:tcPr>
             <w:tcW w:w="2000" w:type="dxa"/>
@@ -6249,12 +6124,6 @@
         </w:tc>
       </w:tr>
       <w:tr>
-        <w:tblPrEx>
-          <w:tblCellMar>
-            <w:top w:w="0" w:type="dxa"/>
-            <w:bottom w:w="0" w:type="dxa"/>
-          </w:tblCellMar>
-        </w:tblPrEx>
         <w:tc>
           <w:tcPr>
             <w:tcW w:w="2000" w:type="dxa"/>
@@ -6335,12 +6204,6 @@
         </w:tc>
       </w:tr>
       <w:tr>
-        <w:tblPrEx>
-          <w:tblCellMar>
-            <w:top w:w="0" w:type="dxa"/>
-            <w:bottom w:w="0" w:type="dxa"/>
-          </w:tblCellMar>
-        </w:tblPrEx>
         <w:tc>
           <w:tcPr>
             <w:tcW w:w="2000" w:type="dxa"/>
@@ -6421,12 +6284,6 @@
         </w:tc>
       </w:tr>
       <w:tr>
-        <w:tblPrEx>
-          <w:tblCellMar>
-            <w:top w:w="0" w:type="dxa"/>
-            <w:bottom w:w="0" w:type="dxa"/>
-          </w:tblCellMar>
-        </w:tblPrEx>
         <w:tc>
           <w:tcPr>
             <w:tcW w:w="2000" w:type="dxa"/>
@@ -6507,12 +6364,6 @@
         </w:tc>
       </w:tr>
       <w:tr>
-        <w:tblPrEx>
-          <w:tblCellMar>
-            <w:top w:w="0" w:type="dxa"/>
-            <w:bottom w:w="0" w:type="dxa"/>
-          </w:tblCellMar>
-        </w:tblPrEx>
         <w:tc>
           <w:tcPr>
             <w:tcW w:w="2000" w:type="dxa"/>
@@ -6593,12 +6444,6 @@
         </w:tc>
       </w:tr>
       <w:tr>
-        <w:tblPrEx>
-          <w:tblCellMar>
-            <w:top w:w="0" w:type="dxa"/>
-            <w:bottom w:w="0" w:type="dxa"/>
-          </w:tblCellMar>
-        </w:tblPrEx>
         <w:tc>
           <w:tcPr>
             <w:tcW w:w="2000" w:type="dxa"/>
@@ -6679,12 +6524,6 @@
         </w:tc>
       </w:tr>
       <w:tr>
-        <w:tblPrEx>
-          <w:tblCellMar>
-            <w:top w:w="0" w:type="dxa"/>
-            <w:bottom w:w="0" w:type="dxa"/>
-          </w:tblCellMar>
-        </w:tblPrEx>
         <w:tc>
           <w:tcPr>
             <w:tcW w:w="2000" w:type="dxa"/>
@@ -6828,12 +6667,6 @@
         <w:gridCol w:w="2400"/>
       </w:tblGrid>
       <w:tr>
-        <w:tblPrEx>
-          <w:tblCellMar>
-            <w:top w:w="0" w:type="dxa"/>
-            <w:bottom w:w="0" w:type="dxa"/>
-          </w:tblCellMar>
-        </w:tblPrEx>
         <w:tc>
           <w:tcPr>
             <w:tcW w:w="1200" w:type="dxa"/>
@@ -7016,12 +6849,6 @@
         </w:tc>
       </w:tr>
       <w:tr>
-        <w:tblPrEx>
-          <w:tblCellMar>
-            <w:top w:w="0" w:type="dxa"/>
-            <w:bottom w:w="0" w:type="dxa"/>
-          </w:tblCellMar>
-        </w:tblPrEx>
         <w:tc>
           <w:tcPr>
             <w:tcW w:w="1200" w:type="dxa"/>
@@ -7180,12 +7007,6 @@
         </w:tc>
       </w:tr>
       <w:tr>
-        <w:tblPrEx>
-          <w:tblCellMar>
-            <w:top w:w="0" w:type="dxa"/>
-            <w:bottom w:w="0" w:type="dxa"/>
-          </w:tblCellMar>
-        </w:tblPrEx>
         <w:tc>
           <w:tcPr>
             <w:tcW w:w="1200" w:type="dxa"/>
@@ -7344,12 +7165,6 @@
         </w:tc>
       </w:tr>
       <w:tr>
-        <w:tblPrEx>
-          <w:tblCellMar>
-            <w:top w:w="0" w:type="dxa"/>
-            <w:bottom w:w="0" w:type="dxa"/>
-          </w:tblCellMar>
-        </w:tblPrEx>
         <w:tc>
           <w:tcPr>
             <w:tcW w:w="1200" w:type="dxa"/>
@@ -7508,12 +7323,6 @@
         </w:tc>
       </w:tr>
       <w:tr>
-        <w:tblPrEx>
-          <w:tblCellMar>
-            <w:top w:w="0" w:type="dxa"/>
-            <w:bottom w:w="0" w:type="dxa"/>
-          </w:tblCellMar>
-        </w:tblPrEx>
         <w:tc>
           <w:tcPr>
             <w:tcW w:w="1200" w:type="dxa"/>
@@ -7784,12 +7593,6 @@
         <w:gridCol w:w="7826"/>
       </w:tblGrid>
       <w:tr>
-        <w:tblPrEx>
-          <w:tblCellMar>
-            <w:top w:w="0" w:type="dxa"/>
-            <w:bottom w:w="0" w:type="dxa"/>
-          </w:tblCellMar>
-        </w:tblPrEx>
         <w:tc>
           <w:tcPr>
             <w:tcW w:w="1200" w:type="dxa"/>
@@ -7852,12 +7655,6 @@
         </w:tc>
       </w:tr>
       <w:tr>
-        <w:tblPrEx>
-          <w:tblCellMar>
-            <w:top w:w="0" w:type="dxa"/>
-            <w:bottom w:w="0" w:type="dxa"/>
-          </w:tblCellMar>
-        </w:tblPrEx>
         <w:tc>
           <w:tcPr>
             <w:tcW w:w="1200" w:type="dxa"/>
@@ -7912,12 +7709,6 @@
         </w:tc>
       </w:tr>
       <w:tr>
-        <w:tblPrEx>
-          <w:tblCellMar>
-            <w:top w:w="0" w:type="dxa"/>
-            <w:bottom w:w="0" w:type="dxa"/>
-          </w:tblCellMar>
-        </w:tblPrEx>
         <w:tc>
           <w:tcPr>
             <w:tcW w:w="1200" w:type="dxa"/>
@@ -7972,12 +7763,6 @@
         </w:tc>
       </w:tr>
       <w:tr>
-        <w:tblPrEx>
-          <w:tblCellMar>
-            <w:top w:w="0" w:type="dxa"/>
-            <w:bottom w:w="0" w:type="dxa"/>
-          </w:tblCellMar>
-        </w:tblPrEx>
         <w:tc>
           <w:tcPr>
             <w:tcW w:w="1200" w:type="dxa"/>
@@ -8032,12 +7817,6 @@
         </w:tc>
       </w:tr>
       <w:tr>
-        <w:tblPrEx>
-          <w:tblCellMar>
-            <w:top w:w="0" w:type="dxa"/>
-            <w:bottom w:w="0" w:type="dxa"/>
-          </w:tblCellMar>
-        </w:tblPrEx>
         <w:tc>
           <w:tcPr>
             <w:tcW w:w="1200" w:type="dxa"/>
@@ -8092,12 +7871,6 @@
         </w:tc>
       </w:tr>
       <w:tr>
-        <w:tblPrEx>
-          <w:tblCellMar>
-            <w:top w:w="0" w:type="dxa"/>
-            <w:bottom w:w="0" w:type="dxa"/>
-          </w:tblCellMar>
-        </w:tblPrEx>
         <w:tc>
           <w:tcPr>
             <w:tcW w:w="1200" w:type="dxa"/>
@@ -8152,12 +7925,6 @@
         </w:tc>
       </w:tr>
       <w:tr>
-        <w:tblPrEx>
-          <w:tblCellMar>
-            <w:top w:w="0" w:type="dxa"/>
-            <w:bottom w:w="0" w:type="dxa"/>
-          </w:tblCellMar>
-        </w:tblPrEx>
         <w:tc>
           <w:tcPr>
             <w:tcW w:w="1200" w:type="dxa"/>
@@ -9018,7 +8785,13 @@
         <w:rPr>
           <w:vertAlign w:val="superscript"/>
         </w:rPr>
-        <w:t>−λz·t</w:t>
+        <w:t>−</w:t>
+      </w:r>
+      <w:r>
+        <w:rPr>
+          <w:vertAlign w:val="superscript"/>
+        </w:rPr>
+        <w:t>λz·t</w:t>
       </w:r>
       <w:r>
         <w:t>. On a log-linear plot, this appears as a straight line with slope −λ</w:t>
@@ -9686,12 +9459,6 @@
         <w:gridCol w:w="6826"/>
       </w:tblGrid>
       <w:tr>
-        <w:tblPrEx>
-          <w:tblCellMar>
-            <w:top w:w="0" w:type="dxa"/>
-            <w:bottom w:w="0" w:type="dxa"/>
-          </w:tblCellMar>
-        </w:tblPrEx>
         <w:tc>
           <w:tcPr>
             <w:tcW w:w="2200" w:type="dxa"/>
@@ -9754,12 +9521,6 @@
         </w:tc>
       </w:tr>
       <w:tr>
-        <w:tblPrEx>
-          <w:tblCellMar>
-            <w:top w:w="0" w:type="dxa"/>
-            <w:bottom w:w="0" w:type="dxa"/>
-          </w:tblCellMar>
-        </w:tblPrEx>
         <w:tc>
           <w:tcPr>
             <w:tcW w:w="2200" w:type="dxa"/>
@@ -9814,12 +9575,6 @@
         </w:tc>
       </w:tr>
       <w:tr>
-        <w:tblPrEx>
-          <w:tblCellMar>
-            <w:top w:w="0" w:type="dxa"/>
-            <w:bottom w:w="0" w:type="dxa"/>
-          </w:tblCellMar>
-        </w:tblPrEx>
         <w:tc>
           <w:tcPr>
             <w:tcW w:w="2200" w:type="dxa"/>
@@ -9874,12 +9629,6 @@
         </w:tc>
       </w:tr>
       <w:tr>
-        <w:tblPrEx>
-          <w:tblCellMar>
-            <w:top w:w="0" w:type="dxa"/>
-            <w:bottom w:w="0" w:type="dxa"/>
-          </w:tblCellMar>
-        </w:tblPrEx>
         <w:tc>
           <w:tcPr>
             <w:tcW w:w="2200" w:type="dxa"/>
@@ -9934,12 +9683,6 @@
         </w:tc>
       </w:tr>
       <w:tr>
-        <w:tblPrEx>
-          <w:tblCellMar>
-            <w:top w:w="0" w:type="dxa"/>
-            <w:bottom w:w="0" w:type="dxa"/>
-          </w:tblCellMar>
-        </w:tblPrEx>
         <w:tc>
           <w:tcPr>
             <w:tcW w:w="2200" w:type="dxa"/>
@@ -9994,12 +9737,6 @@
         </w:tc>
       </w:tr>
       <w:tr>
-        <w:tblPrEx>
-          <w:tblCellMar>
-            <w:top w:w="0" w:type="dxa"/>
-            <w:bottom w:w="0" w:type="dxa"/>
-          </w:tblCellMar>
-        </w:tblPrEx>
         <w:tc>
           <w:tcPr>
             <w:tcW w:w="2200" w:type="dxa"/>
@@ -10054,12 +9791,6 @@
         </w:tc>
       </w:tr>
       <w:tr>
-        <w:tblPrEx>
-          <w:tblCellMar>
-            <w:top w:w="0" w:type="dxa"/>
-            <w:bottom w:w="0" w:type="dxa"/>
-          </w:tblCellMar>
-        </w:tblPrEx>
         <w:tc>
           <w:tcPr>
             <w:tcW w:w="2200" w:type="dxa"/>
@@ -10114,12 +9845,6 @@
         </w:tc>
       </w:tr>
       <w:tr>
-        <w:tblPrEx>
-          <w:tblCellMar>
-            <w:top w:w="0" w:type="dxa"/>
-            <w:bottom w:w="0" w:type="dxa"/>
-          </w:tblCellMar>
-        </w:tblPrEx>
         <w:tc>
           <w:tcPr>
             <w:tcW w:w="2200" w:type="dxa"/>
@@ -10174,12 +9899,6 @@
         </w:tc>
       </w:tr>
       <w:tr>
-        <w:tblPrEx>
-          <w:tblCellMar>
-            <w:top w:w="0" w:type="dxa"/>
-            <w:bottom w:w="0" w:type="dxa"/>
-          </w:tblCellMar>
-        </w:tblPrEx>
         <w:tc>
           <w:tcPr>
             <w:tcW w:w="2200" w:type="dxa"/>
@@ -10234,12 +9953,6 @@
         </w:tc>
       </w:tr>
       <w:tr>
-        <w:tblPrEx>
-          <w:tblCellMar>
-            <w:top w:w="0" w:type="dxa"/>
-            <w:bottom w:w="0" w:type="dxa"/>
-          </w:tblCellMar>
-        </w:tblPrEx>
         <w:tc>
           <w:tcPr>
             <w:tcW w:w="2200" w:type="dxa"/>
@@ -10294,12 +10007,6 @@
         </w:tc>
       </w:tr>
       <w:tr>
-        <w:tblPrEx>
-          <w:tblCellMar>
-            <w:top w:w="0" w:type="dxa"/>
-            <w:bottom w:w="0" w:type="dxa"/>
-          </w:tblCellMar>
-        </w:tblPrEx>
         <w:tc>
           <w:tcPr>
             <w:tcW w:w="2200" w:type="dxa"/>
@@ -10354,12 +10061,6 @@
         </w:tc>
       </w:tr>
       <w:tr>
-        <w:tblPrEx>
-          <w:tblCellMar>
-            <w:top w:w="0" w:type="dxa"/>
-            <w:bottom w:w="0" w:type="dxa"/>
-          </w:tblCellMar>
-        </w:tblPrEx>
         <w:tc>
           <w:tcPr>
             <w:tcW w:w="2200" w:type="dxa"/>
@@ -10414,12 +10115,6 @@
         </w:tc>
       </w:tr>
       <w:tr>
-        <w:tblPrEx>
-          <w:tblCellMar>
-            <w:top w:w="0" w:type="dxa"/>
-            <w:bottom w:w="0" w:type="dxa"/>
-          </w:tblCellMar>
-        </w:tblPrEx>
         <w:tc>
           <w:tcPr>
             <w:tcW w:w="2200" w:type="dxa"/>
@@ -10474,12 +10169,6 @@
         </w:tc>
       </w:tr>
       <w:tr>
-        <w:tblPrEx>
-          <w:tblCellMar>
-            <w:top w:w="0" w:type="dxa"/>
-            <w:bottom w:w="0" w:type="dxa"/>
-          </w:tblCellMar>
-        </w:tblPrEx>
         <w:tc>
           <w:tcPr>
             <w:tcW w:w="2200" w:type="dxa"/>
@@ -10534,12 +10223,6 @@
         </w:tc>
       </w:tr>
       <w:tr>
-        <w:tblPrEx>
-          <w:tblCellMar>
-            <w:top w:w="0" w:type="dxa"/>
-            <w:bottom w:w="0" w:type="dxa"/>
-          </w:tblCellMar>
-        </w:tblPrEx>
         <w:tc>
           <w:tcPr>
             <w:tcW w:w="2200" w:type="dxa"/>
@@ -10594,12 +10277,6 @@
         </w:tc>
       </w:tr>
       <w:tr>
-        <w:tblPrEx>
-          <w:tblCellMar>
-            <w:top w:w="0" w:type="dxa"/>
-            <w:bottom w:w="0" w:type="dxa"/>
-          </w:tblCellMar>
-        </w:tblPrEx>
         <w:tc>
           <w:tcPr>
             <w:tcW w:w="2200" w:type="dxa"/>
@@ -10654,12 +10331,6 @@
         </w:tc>
       </w:tr>
       <w:tr>
-        <w:tblPrEx>
-          <w:tblCellMar>
-            <w:top w:w="0" w:type="dxa"/>
-            <w:bottom w:w="0" w:type="dxa"/>
-          </w:tblCellMar>
-        </w:tblPrEx>
         <w:tc>
           <w:tcPr>
             <w:tcW w:w="2200" w:type="dxa"/>
@@ -10714,12 +10385,6 @@
         </w:tc>
       </w:tr>
       <w:tr>
-        <w:tblPrEx>
-          <w:tblCellMar>
-            <w:top w:w="0" w:type="dxa"/>
-            <w:bottom w:w="0" w:type="dxa"/>
-          </w:tblCellMar>
-        </w:tblPrEx>
         <w:tc>
           <w:tcPr>
             <w:tcW w:w="2200" w:type="dxa"/>
@@ -10774,12 +10439,6 @@
         </w:tc>
       </w:tr>
       <w:tr>
-        <w:tblPrEx>
-          <w:tblCellMar>
-            <w:top w:w="0" w:type="dxa"/>
-            <w:bottom w:w="0" w:type="dxa"/>
-          </w:tblCellMar>
-        </w:tblPrEx>
         <w:tc>
           <w:tcPr>
             <w:tcW w:w="2200" w:type="dxa"/>
@@ -10834,12 +10493,6 @@
         </w:tc>
       </w:tr>
       <w:tr>
-        <w:tblPrEx>
-          <w:tblCellMar>
-            <w:top w:w="0" w:type="dxa"/>
-            <w:bottom w:w="0" w:type="dxa"/>
-          </w:tblCellMar>
-        </w:tblPrEx>
         <w:tc>
           <w:tcPr>
             <w:tcW w:w="2200" w:type="dxa"/>
@@ -10894,12 +10547,6 @@
         </w:tc>
       </w:tr>
       <w:tr>
-        <w:tblPrEx>
-          <w:tblCellMar>
-            <w:top w:w="0" w:type="dxa"/>
-            <w:bottom w:w="0" w:type="dxa"/>
-          </w:tblCellMar>
-        </w:tblPrEx>
         <w:tc>
           <w:tcPr>
             <w:tcW w:w="2200" w:type="dxa"/>
@@ -10954,12 +10601,6 @@
         </w:tc>
       </w:tr>
       <w:tr>
-        <w:tblPrEx>
-          <w:tblCellMar>
-            <w:top w:w="0" w:type="dxa"/>
-            <w:bottom w:w="0" w:type="dxa"/>
-          </w:tblCellMar>
-        </w:tblPrEx>
         <w:tc>
           <w:tcPr>
             <w:tcW w:w="2200" w:type="dxa"/>
@@ -11014,12 +10655,6 @@
         </w:tc>
       </w:tr>
       <w:tr>
-        <w:tblPrEx>
-          <w:tblCellMar>
-            <w:top w:w="0" w:type="dxa"/>
-            <w:bottom w:w="0" w:type="dxa"/>
-          </w:tblCellMar>
-        </w:tblPrEx>
         <w:tc>
           <w:tcPr>
             <w:tcW w:w="2200" w:type="dxa"/>
@@ -11106,12 +10741,6 @@
         <w:gridCol w:w="6826"/>
       </w:tblGrid>
       <w:tr>
-        <w:tblPrEx>
-          <w:tblCellMar>
-            <w:top w:w="0" w:type="dxa"/>
-            <w:bottom w:w="0" w:type="dxa"/>
-          </w:tblCellMar>
-        </w:tblPrEx>
         <w:tc>
           <w:tcPr>
             <w:tcW w:w="2200" w:type="dxa"/>
@@ -11174,12 +10803,6 @@
         </w:tc>
       </w:tr>
       <w:tr>
-        <w:tblPrEx>
-          <w:tblCellMar>
-            <w:top w:w="0" w:type="dxa"/>
-            <w:bottom w:w="0" w:type="dxa"/>
-          </w:tblCellMar>
-        </w:tblPrEx>
         <w:tc>
           <w:tcPr>
             <w:tcW w:w="2200" w:type="dxa"/>
@@ -11234,12 +10857,6 @@
         </w:tc>
       </w:tr>
       <w:tr>
-        <w:tblPrEx>
-          <w:tblCellMar>
-            <w:top w:w="0" w:type="dxa"/>
-            <w:bottom w:w="0" w:type="dxa"/>
-          </w:tblCellMar>
-        </w:tblPrEx>
         <w:tc>
           <w:tcPr>
             <w:tcW w:w="2200" w:type="dxa"/>
@@ -11294,12 +10911,6 @@
         </w:tc>
       </w:tr>
       <w:tr>
-        <w:tblPrEx>
-          <w:tblCellMar>
-            <w:top w:w="0" w:type="dxa"/>
-            <w:bottom w:w="0" w:type="dxa"/>
-          </w:tblCellMar>
-        </w:tblPrEx>
         <w:tc>
           <w:tcPr>
             <w:tcW w:w="2200" w:type="dxa"/>
@@ -11354,12 +10965,6 @@
         </w:tc>
       </w:tr>
       <w:tr>
-        <w:tblPrEx>
-          <w:tblCellMar>
-            <w:top w:w="0" w:type="dxa"/>
-            <w:bottom w:w="0" w:type="dxa"/>
-          </w:tblCellMar>
-        </w:tblPrEx>
         <w:tc>
           <w:tcPr>
             <w:tcW w:w="2200" w:type="dxa"/>
@@ -11414,12 +11019,6 @@
         </w:tc>
       </w:tr>
       <w:tr>
-        <w:tblPrEx>
-          <w:tblCellMar>
-            <w:top w:w="0" w:type="dxa"/>
-            <w:bottom w:w="0" w:type="dxa"/>
-          </w:tblCellMar>
-        </w:tblPrEx>
         <w:tc>
           <w:tcPr>
             <w:tcW w:w="2200" w:type="dxa"/>
@@ -11474,12 +11073,6 @@
         </w:tc>
       </w:tr>
       <w:tr>
-        <w:tblPrEx>
-          <w:tblCellMar>
-            <w:top w:w="0" w:type="dxa"/>
-            <w:bottom w:w="0" w:type="dxa"/>
-          </w:tblCellMar>
-        </w:tblPrEx>
         <w:tc>
           <w:tcPr>
             <w:tcW w:w="2200" w:type="dxa"/>
@@ -11534,12 +11127,6 @@
         </w:tc>
       </w:tr>
       <w:tr>
-        <w:tblPrEx>
-          <w:tblCellMar>
-            <w:top w:w="0" w:type="dxa"/>
-            <w:bottom w:w="0" w:type="dxa"/>
-          </w:tblCellMar>
-        </w:tblPrEx>
         <w:tc>
           <w:tcPr>
             <w:tcW w:w="2200" w:type="dxa"/>

</xml_diff>